<commit_message>
Refine Library writeup explanations
</commit_message>
<xml_diff>
--- a/Library-Writeup-Redacted.docx
+++ b/Library-Writeup-Redacted.docx
@@ -108,6 +108,22 @@
     </w:p>
     <w:p>
       <w:pPr>
+        <w:pStyle w:val="Heading2"/>
+      </w:pPr>
+      <w:r>
+        <w:t>Attack path</w:t>
+      </w:r>
+    </w:p>
+    <w:p>
+      <w:pPr>
+        <w:pStyle w:val="Finding"/>
+      </w:pPr>
+      <w:r>
+        <w:t>Nmap → robots.txt → Username discovery → Hydra → SSH → Sudo misconfiguration → Replaceable Python script → Root</w:t>
+      </w:r>
+    </w:p>
+    <w:p>
+      <w:pPr>
         <w:pStyle w:val="Heading1"/>
       </w:pPr>
       <w:r>
@@ -441,7 +457,15 @@
     </w:p>
     <w:p>
       <w:r>
-        <w:t>The Hydra build used in this session accepted the compressed list directly, as confirmed by the successful run below. On a system that requires plain-text input, the archive can instead be expanded with gzip -dk.</w:t>
+        <w:t>The Hydra build used in this session accepted the compressed list directly, as confirmed by the successful run below. On systems that require plain-text input, the archive can be decompressed with:</w:t>
+      </w:r>
+    </w:p>
+    <w:p>
+      <w:pPr>
+        <w:pStyle w:val="CodeBlock"/>
+      </w:pPr>
+      <w:r>
+        <w:t>gzip -dk /usr/share/wordlists/rockyou.txt.gz</w:t>
       </w:r>
     </w:p>
     <w:p>
@@ -740,6 +764,14 @@
     </w:p>
     <w:p>
       <w:pPr>
+        <w:pStyle w:val="CodeBlock"/>
+      </w:pPr>
+      <w:r>
+        <w:t>ls: cannot open directory '/root': Permission denied</w:t>
+      </w:r>
+    </w:p>
+    <w:p>
+      <w:pPr>
         <w:jc w:val="center"/>
       </w:pPr>
       <w:r>
@@ -848,7 +880,7 @@
     </w:p>
     <w:p>
       <w:r>
-        <w:t>The rule allowed a Python interpreter matching /usr/bin/python* to execute /home/meliodas/bak.py as root without a password. The file was owned by meliodas and writable, so its contents could be replaced before sudo executed it.</w:t>
+        <w:t>The rule allowed a Python interpreter matching /usr/bin/python* to execute /home/meliodas/bak.py as root without a password. Because meliodas had write and execute permissions on the parent directory, the file could be removed and recreated before sudo executed it. In Linux, deleting a file depends primarily on write and execute permissions on its parent directory, not on write permission to the file itself.</w:t>
       </w:r>
     </w:p>
     <w:p>
@@ -914,7 +946,7 @@
     </w:p>
     <w:p>
       <w:r>
-        <w:t>I recreated bak.py with a short Python payload that replaces the interpreter process with a Bash shell. The -p option tells Bash to preserve its effective user ID.</w:t>
+        <w:t>I recreated bak.py with a short Python payload that replaces the interpreter process with a Bash shell. The -p option instructs Bash to preserve the effective user ID instead of dropping the elevated privileges.</w:t>
       </w:r>
     </w:p>
     <w:p>
@@ -1002,6 +1034,7 @@
     <w:p>
       <w:pPr>
         <w:pStyle w:val="Heading2"/>
+        <w:pageBreakBefore/>
       </w:pPr>
       <w:r>
         <w:t>Obtaining a root shell</w:t>

</xml_diff>